<commit_message>
resume: move TCO, NPV and IRR models under Senior Product Manager
Owner correction: the customer-project financial models were product
work. Site layouts sized to setback limits stay with the systems
engineer role.

Co-Authored-By: Claude Opus 5.5 <noreply@anthropic.com>
Claude-Session: https://claude.ai/code/session_01FCbMWJwYxnDm3wqJx41114
</commit_message>
<xml_diff>
--- a/resume/GabrielJew_202610.docx
+++ b/resume/GabrielJew_202610.docx
@@ -152,7 +152,7 @@
         <w:spacing w:after="20"/>
       </w:pPr>
       <w:r>
-        <w:t>Owned bottom-up pricing and component-to-system unit economics for RFPs.</w:t>
+        <w:t>Owned bottom-up pricing and component-to-system unit economics for RFPs, and built TCO, NPV, and IRR models for customer projects.</w:t>
       </w:r>
     </w:p>
     <w:p>
@@ -210,16 +210,7 @@
         <w:spacing w:after="20"/>
       </w:pPr>
       <w:r>
-        <w:t>Led technical sales and application engineering for IPP developers and EPCs. Sized systems, paired inverters, and planned augmentation with degradation models.</w:t>
-      </w:r>
-    </w:p>
-    <w:p>
-      <w:pPr>
-        <w:pStyle w:val="ListBullet"/>
-        <w:spacing w:after="20"/>
-      </w:pPr>
-      <w:r>
-        <w:t>Built TCO, NPV, and IRR models for customer projects, with site layouts sized to setback limits.</w:t>
+        <w:t>Led technical sales and application engineering for IPP developers and EPCs. Sized systems, paired inverters, and planned augmentation with degradation models. Drew site layouts sized to setback limits.</w:t>
       </w:r>
     </w:p>
     <w:p>

</xml_diff>

<commit_message>
resume: move TCO, NPV and IRR models under Senior Product Manager (#255)
Owner correction: the customer-project financial models were product
work. Site layouts sized to setback limits stay with the systems
engineer role.


Claude-Session: https://claude.ai/code/session_01FCbMWJwYxnDm3wqJx41114

Co-authored-by: Claude <noreply@anthropic.com>
</commit_message>
<xml_diff>
--- a/resume/GabrielJew_202610.docx
+++ b/resume/GabrielJew_202610.docx
@@ -152,7 +152,7 @@
         <w:spacing w:after="20"/>
       </w:pPr>
       <w:r>
-        <w:t>Owned bottom-up pricing and component-to-system unit economics for RFPs.</w:t>
+        <w:t>Owned bottom-up pricing and component-to-system unit economics for RFPs, and built TCO, NPV, and IRR models for customer projects.</w:t>
       </w:r>
     </w:p>
     <w:p>
@@ -210,16 +210,7 @@
         <w:spacing w:after="20"/>
       </w:pPr>
       <w:r>
-        <w:t>Led technical sales and application engineering for IPP developers and EPCs. Sized systems, paired inverters, and planned augmentation with degradation models.</w:t>
-      </w:r>
-    </w:p>
-    <w:p>
-      <w:pPr>
-        <w:pStyle w:val="ListBullet"/>
-        <w:spacing w:after="20"/>
-      </w:pPr>
-      <w:r>
-        <w:t>Built TCO, NPV, and IRR models for customer projects, with site layouts sized to setback limits.</w:t>
+        <w:t>Led technical sales and application engineering for IPP developers and EPCs. Sized systems, paired inverters, and planned augmentation with degradation models. Drew site layouts sized to setback limits.</w:t>
       </w:r>
     </w:p>
     <w:p>

</xml_diff>